<commit_message>
update census data exercise
</commit_message>
<xml_diff>
--- a/Downloading_Census_Data.docx
+++ b/Downloading_Census_Data.docx
@@ -1,6 +1,6 @@
 
 <file path=word/document.xml><?xml version="1.0" encoding="utf-8"?>
-<w:document xmlns:wpc="http://schemas.microsoft.com/office/word/2010/wordprocessingCanvas" xmlns:cx="http://schemas.microsoft.com/office/drawing/2014/chartex" xmlns:cx1="http://schemas.microsoft.com/office/drawing/2015/9/8/chartex" xmlns:cx2="http://schemas.microsoft.com/office/drawing/2015/10/21/chartex" xmlns:cx3="http://schemas.microsoft.com/office/drawing/2016/5/9/chartex" xmlns:cx4="http://schemas.microsoft.com/office/drawing/2016/5/10/chartex" xmlns:cx5="http://schemas.microsoft.com/office/drawing/2016/5/11/chartex" xmlns:cx6="http://schemas.microsoft.com/office/drawing/2016/5/12/chartex" xmlns:cx7="http://schemas.microsoft.com/office/drawing/2016/5/13/chartex" xmlns:cx8="http://schemas.microsoft.com/office/drawing/2016/5/14/chartex" xmlns:mc="http://schemas.openxmlformats.org/markup-compatibility/2006" xmlns:aink="http://schemas.microsoft.com/office/drawing/2016/ink" xmlns:am3d="http://schemas.microsoft.com/office/drawing/2017/model3d" xmlns:o="urn:schemas-microsoft-com:office:office" xmlns:oel="http://schemas.microsoft.com/office/2019/extlst" xmlns:r="http://schemas.openxmlformats.org/officeDocument/2006/relationships" xmlns:m="http://schemas.openxmlformats.org/officeDocument/2006/math" xmlns:v="urn:schemas-microsoft-com:vml" xmlns:wp14="http://schemas.microsoft.com/office/word/2010/wordprocessingDrawing" xmlns:wp="http://schemas.openxmlformats.org/drawingml/2006/wordprocessingDrawing" xmlns:w10="urn:schemas-microsoft-com:office:word" xmlns:w="http://schemas.openxmlformats.org/wordprocessingml/2006/main" xmlns:w14="http://schemas.microsoft.com/office/word/2010/wordml" xmlns:w15="http://schemas.microsoft.com/office/word/2012/wordml" xmlns:w16cex="http://schemas.microsoft.com/office/word/2018/wordml/cex" xmlns:w16cid="http://schemas.microsoft.com/office/word/2016/wordml/cid" xmlns:w16="http://schemas.microsoft.com/office/word/2018/wordml" xmlns:w16du="http://schemas.microsoft.com/office/word/2023/wordml/word16du" xmlns:w16sdtdh="http://schemas.microsoft.com/office/word/2020/wordml/sdtdatahash" xmlns:w16se="http://schemas.microsoft.com/office/word/2015/wordml/symex" xmlns:wpg="http://schemas.microsoft.com/office/word/2010/wordprocessingGroup" xmlns:wpi="http://schemas.microsoft.com/office/word/2010/wordprocessingInk" xmlns:wne="http://schemas.microsoft.com/office/word/2006/wordml" xmlns:wps="http://schemas.microsoft.com/office/word/2010/wordprocessingShape" mc:Ignorable="w14 w15 w16se w16cid w16 w16cex w16sdtdh w16du wp14">
+<w:document xmlns:wpc="http://schemas.microsoft.com/office/word/2010/wordprocessingCanvas" xmlns:cx="http://schemas.microsoft.com/office/drawing/2014/chartex" xmlns:cx1="http://schemas.microsoft.com/office/drawing/2015/9/8/chartex" xmlns:cx2="http://schemas.microsoft.com/office/drawing/2015/10/21/chartex" xmlns:cx3="http://schemas.microsoft.com/office/drawing/2016/5/9/chartex" xmlns:cx4="http://schemas.microsoft.com/office/drawing/2016/5/10/chartex" xmlns:cx5="http://schemas.microsoft.com/office/drawing/2016/5/11/chartex" xmlns:cx6="http://schemas.microsoft.com/office/drawing/2016/5/12/chartex" xmlns:cx7="http://schemas.microsoft.com/office/drawing/2016/5/13/chartex" xmlns:cx8="http://schemas.microsoft.com/office/drawing/2016/5/14/chartex" xmlns:mc="http://schemas.openxmlformats.org/markup-compatibility/2006" xmlns:m="http://schemas.openxmlformats.org/officeDocument/2006/math" xmlns:aink="http://schemas.microsoft.com/office/drawing/2016/ink" xmlns:am3d="http://schemas.microsoft.com/office/drawing/2017/model3d" xmlns:oel="http://schemas.microsoft.com/office/2019/extlst" xmlns:r="http://schemas.openxmlformats.org/officeDocument/2006/relationships" xmlns:wp14="http://schemas.microsoft.com/office/word/2010/wordprocessingDrawing" xmlns:wp="http://schemas.openxmlformats.org/drawingml/2006/wordprocessingDrawing" xmlns:wpg="http://schemas.microsoft.com/office/word/2010/wordprocessingGroup" xmlns:wpi="http://schemas.microsoft.com/office/word/2010/wordprocessingInk" xmlns:wps="http://schemas.microsoft.com/office/word/2010/wordprocessingShape" xmlns:o="urn:schemas-microsoft-com:office:office" xmlns:v="urn:schemas-microsoft-com:vml" xmlns:w10="urn:schemas-microsoft-com:office:word" xmlns:w="http://schemas.openxmlformats.org/wordprocessingml/2006/main" xmlns:w14="http://schemas.microsoft.com/office/word/2010/wordml" xmlns:w15="http://schemas.microsoft.com/office/word/2012/wordml" xmlns:w16cex="http://schemas.microsoft.com/office/word/2018/wordml/cex" xmlns:w16cid="http://schemas.microsoft.com/office/word/2016/wordml/cid" xmlns:w16="http://schemas.microsoft.com/office/word/2018/wordml" xmlns:w16sdtdh="http://schemas.microsoft.com/office/word/2020/wordml/sdtdatahash" xmlns:w16sdtfl="http://schemas.microsoft.com/office/word/2024/wordml/sdtformatlock" xmlns:w16se="http://schemas.microsoft.com/office/word/2015/wordml/symex" xmlns:w16du="http://schemas.microsoft.com/office/word/2023/wordml/word16du" xmlns:wne="http://schemas.microsoft.com/office/word/2006/wordml" mc:Ignorable="w14 w15 w16se w16cid w16 w16cex w16sdtdh w16sdtfl w16du wp14">
   <w:body>
     <w:p>
       <w:pPr>
@@ -16,8 +16,16 @@
         <w:t>Downloading and mapping Census data</w:t>
       </w:r>
       <w:r>
-        <w:pict w14:anchorId="73DD9C4E">
-          <v:rect id="_x0000_i1025" style="width:0;height:.75pt" o:hralign="center" o:hrstd="t" o:hrnoshade="t" o:hr="t" fillcolor="#ccc" stroked="f"/>
+        <w:rPr>
+          <w:noProof/>
+        </w:rPr>
+      </w:r>
+      <w:r>
+        <w:pict w14:anchorId="466F0337">
+          <v:rect id="Horizontal Line 1" o:spid="_x0000_s1028" style="width:468pt;height:.35pt;visibility:visible;mso-wrap-style:square;mso-left-percent:-10001;mso-top-percent:-10001;mso-position-horizontal:absolute;mso-position-horizontal-relative:char;mso-position-vertical:absolute;mso-position-vertical-relative:line;mso-left-percent:-10001;mso-top-percent:-10001;v-text-anchor:top" o:gfxdata="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" fillcolor="#ccc" stroked="f">
+            <o:lock v:ext="edit" rotation="t" aspectratio="t" verticies="t" text="t" shapetype="t"/>
+            <w10:anchorlock/>
+          </v:rect>
         </w:pict>
       </w:r>
     </w:p>
@@ -192,8 +200,16 @@
     </w:p>
     <w:p>
       <w:r>
-        <w:pict w14:anchorId="17C248E9">
-          <v:rect id="_x0000_i1026" style="width:0;height:.75pt" o:hralign="center" o:hrstd="t" o:hrnoshade="t" o:hr="t" fillcolor="#ccc" stroked="f"/>
+        <w:rPr>
+          <w:noProof/>
+        </w:rPr>
+      </w:r>
+      <w:r>
+        <w:pict w14:anchorId="7618E793">
+          <v:rect id="Horizontal Line 2" o:spid="_x0000_s1027" style="width:468pt;height:.35pt;visibility:visible;mso-wrap-style:square;mso-left-percent:-10001;mso-top-percent:-10001;mso-position-horizontal:absolute;mso-position-horizontal-relative:char;mso-position-vertical:absolute;mso-position-vertical-relative:line;mso-left-percent:-10001;mso-top-percent:-10001;v-text-anchor:top" o:gfxdata="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" fillcolor="#ccc" stroked="f">
+            <o:lock v:ext="edit" rotation="t" aspectratio="t" verticies="t" text="t" shapetype="t"/>
+            <w10:anchorlock/>
+          </v:rect>
         </w:pict>
       </w:r>
     </w:p>
@@ -233,13 +249,15 @@
           <w:pPr>
             <w:pStyle w:val="TOC1"/>
             <w:tabs>
-              <w:tab w:val="left" w:pos="1100"/>
+              <w:tab w:val="left" w:pos="1200"/>
               <w:tab w:val="right" w:leader="dot" w:pos="9350"/>
             </w:tabs>
             <w:rPr>
               <w:rFonts w:asciiTheme="minorHAnsi" w:eastAsiaTheme="minorEastAsia" w:hAnsiTheme="minorHAnsi"/>
               <w:noProof/>
-              <w:sz w:val="22"/>
+              <w:kern w:val="2"/>
+              <w:szCs w:val="24"/>
+              <w14:ligatures w14:val="standardContextual"/>
             </w:rPr>
           </w:pPr>
           <w:r>
@@ -251,7 +269,7 @@
           <w:r>
             <w:fldChar w:fldCharType="separate"/>
           </w:r>
-          <w:hyperlink w:anchor="_Toc83587070" w:history="1">
+          <w:hyperlink w:anchor="_Toc242093248" w:history="1">
             <w:r>
               <w:rPr>
                 <w:rStyle w:val="Hyperlink"/>
@@ -264,7 +282,9 @@
               <w:rPr>
                 <w:rFonts w:asciiTheme="minorHAnsi" w:eastAsiaTheme="minorEastAsia" w:hAnsiTheme="minorHAnsi"/>
                 <w:noProof/>
-                <w:sz w:val="22"/>
+                <w:kern w:val="2"/>
+                <w:szCs w:val="24"/>
+                <w14:ligatures w14:val="standardContextual"/>
               </w:rPr>
               <w:tab/>
             </w:r>
@@ -273,7 +293,7 @@
                 <w:rStyle w:val="Hyperlink"/>
                 <w:noProof/>
               </w:rPr>
-              <w:t>Open Social Explorer website</w:t>
+              <w:t>Create a new ArcGIS project and open Social Explorer website</w:t>
             </w:r>
             <w:r>
               <w:rPr>
@@ -294,7 +314,7 @@
                 <w:noProof/>
                 <w:webHidden/>
               </w:rPr>
-              <w:instrText xml:space="preserve"> PAGEREF _Toc83587070 \h </w:instrText>
+              <w:instrText xml:space="preserve"> PAGEREF _Toc242093248 \h </w:instrText>
             </w:r>
             <w:r>
               <w:rPr>
@@ -329,16 +349,18 @@
           <w:pPr>
             <w:pStyle w:val="TOC1"/>
             <w:tabs>
-              <w:tab w:val="left" w:pos="1100"/>
+              <w:tab w:val="left" w:pos="1200"/>
               <w:tab w:val="right" w:leader="dot" w:pos="9350"/>
             </w:tabs>
             <w:rPr>
               <w:rFonts w:asciiTheme="minorHAnsi" w:eastAsiaTheme="minorEastAsia" w:hAnsiTheme="minorHAnsi"/>
               <w:noProof/>
-              <w:sz w:val="22"/>
+              <w:kern w:val="2"/>
+              <w:szCs w:val="24"/>
+              <w14:ligatures w14:val="standardContextual"/>
             </w:rPr>
           </w:pPr>
-          <w:hyperlink w:anchor="_Toc83587071" w:history="1">
+          <w:hyperlink w:anchor="_Toc242093249" w:history="1">
             <w:r>
               <w:rPr>
                 <w:rStyle w:val="Hyperlink"/>
@@ -350,7 +372,9 @@
               <w:rPr>
                 <w:rFonts w:asciiTheme="minorHAnsi" w:eastAsiaTheme="minorEastAsia" w:hAnsiTheme="minorHAnsi"/>
                 <w:noProof/>
-                <w:sz w:val="22"/>
+                <w:kern w:val="2"/>
+                <w:szCs w:val="24"/>
+                <w14:ligatures w14:val="standardContextual"/>
               </w:rPr>
               <w:tab/>
             </w:r>
@@ -359,7 +383,7 @@
                 <w:rStyle w:val="Hyperlink"/>
                 <w:noProof/>
               </w:rPr>
-              <w:t>Selecting the spatial extent</w:t>
+              <w:t>Modifying the census data table in ArcGIS Pro</w:t>
             </w:r>
             <w:r>
               <w:rPr>
@@ -380,7 +404,7 @@
                 <w:noProof/>
                 <w:webHidden/>
               </w:rPr>
-              <w:instrText xml:space="preserve"> PAGEREF _Toc83587071 \h </w:instrText>
+              <w:instrText xml:space="preserve"> PAGEREF _Toc242093249 \h </w:instrText>
             </w:r>
             <w:r>
               <w:rPr>
@@ -415,16 +439,18 @@
           <w:pPr>
             <w:pStyle w:val="TOC1"/>
             <w:tabs>
-              <w:tab w:val="left" w:pos="1100"/>
+              <w:tab w:val="left" w:pos="1200"/>
               <w:tab w:val="right" w:leader="dot" w:pos="9350"/>
             </w:tabs>
             <w:rPr>
               <w:rFonts w:asciiTheme="minorHAnsi" w:eastAsiaTheme="minorEastAsia" w:hAnsiTheme="minorHAnsi"/>
               <w:noProof/>
-              <w:sz w:val="22"/>
+              <w:kern w:val="2"/>
+              <w:szCs w:val="24"/>
+              <w14:ligatures w14:val="standardContextual"/>
             </w:rPr>
           </w:pPr>
-          <w:hyperlink w:anchor="_Toc83587072" w:history="1">
+          <w:hyperlink w:anchor="_Toc242093250" w:history="1">
             <w:r>
               <w:rPr>
                 <w:rStyle w:val="Hyperlink"/>
@@ -436,7 +462,9 @@
               <w:rPr>
                 <w:rFonts w:asciiTheme="minorHAnsi" w:eastAsiaTheme="minorEastAsia" w:hAnsiTheme="minorHAnsi"/>
                 <w:noProof/>
-                <w:sz w:val="22"/>
+                <w:kern w:val="2"/>
+                <w:szCs w:val="24"/>
+                <w14:ligatures w14:val="standardContextual"/>
               </w:rPr>
               <w:tab/>
             </w:r>
@@ -445,7 +473,7 @@
                 <w:rStyle w:val="Hyperlink"/>
                 <w:noProof/>
               </w:rPr>
-              <w:t>Selecting and downloading census attributes</w:t>
+              <w:t>Downloading Census shapefile</w:t>
             </w:r>
             <w:r>
               <w:rPr>
@@ -466,7 +494,7 @@
                 <w:noProof/>
                 <w:webHidden/>
               </w:rPr>
-              <w:instrText xml:space="preserve"> PAGEREF _Toc83587072 \h </w:instrText>
+              <w:instrText xml:space="preserve"> PAGEREF _Toc242093250 \h </w:instrText>
             </w:r>
             <w:r>
               <w:rPr>
@@ -486,7 +514,7 @@
                 <w:noProof/>
                 <w:webHidden/>
               </w:rPr>
-              <w:t>3</w:t>
+              <w:t>4</w:t>
             </w:r>
             <w:r>
               <w:rPr>
@@ -501,16 +529,18 @@
           <w:pPr>
             <w:pStyle w:val="TOC1"/>
             <w:tabs>
-              <w:tab w:val="left" w:pos="1100"/>
+              <w:tab w:val="left" w:pos="1200"/>
               <w:tab w:val="right" w:leader="dot" w:pos="9350"/>
             </w:tabs>
             <w:rPr>
               <w:rFonts w:asciiTheme="minorHAnsi" w:eastAsiaTheme="minorEastAsia" w:hAnsiTheme="minorHAnsi"/>
               <w:noProof/>
-              <w:sz w:val="22"/>
+              <w:kern w:val="2"/>
+              <w:szCs w:val="24"/>
+              <w14:ligatures w14:val="standardContextual"/>
             </w:rPr>
           </w:pPr>
-          <w:hyperlink w:anchor="_Toc83587073" w:history="1">
+          <w:hyperlink w:anchor="_Toc242093251" w:history="1">
             <w:r>
               <w:rPr>
                 <w:rStyle w:val="Hyperlink"/>
@@ -522,7 +552,9 @@
               <w:rPr>
                 <w:rFonts w:asciiTheme="minorHAnsi" w:eastAsiaTheme="minorEastAsia" w:hAnsiTheme="minorHAnsi"/>
                 <w:noProof/>
-                <w:sz w:val="22"/>
+                <w:kern w:val="2"/>
+                <w:szCs w:val="24"/>
+                <w14:ligatures w14:val="standardContextual"/>
               </w:rPr>
               <w:tab/>
             </w:r>
@@ -531,7 +563,7 @@
                 <w:rStyle w:val="Hyperlink"/>
                 <w:noProof/>
               </w:rPr>
-              <w:t>Modifying the census data table in Excel</w:t>
+              <w:t>Loading the census table and shapefile in ArcGIS</w:t>
             </w:r>
             <w:r>
               <w:rPr>
@@ -552,7 +584,7 @@
                 <w:noProof/>
                 <w:webHidden/>
               </w:rPr>
-              <w:instrText xml:space="preserve"> PAGEREF _Toc83587073 \h </w:instrText>
+              <w:instrText xml:space="preserve"> PAGEREF _Toc242093251 \h </w:instrText>
             </w:r>
             <w:r>
               <w:rPr>
@@ -587,16 +619,18 @@
           <w:pPr>
             <w:pStyle w:val="TOC1"/>
             <w:tabs>
-              <w:tab w:val="left" w:pos="1100"/>
+              <w:tab w:val="left" w:pos="1200"/>
               <w:tab w:val="right" w:leader="dot" w:pos="9350"/>
             </w:tabs>
             <w:rPr>
               <w:rFonts w:asciiTheme="minorHAnsi" w:eastAsiaTheme="minorEastAsia" w:hAnsiTheme="minorHAnsi"/>
               <w:noProof/>
-              <w:sz w:val="22"/>
+              <w:kern w:val="2"/>
+              <w:szCs w:val="24"/>
+              <w14:ligatures w14:val="standardContextual"/>
             </w:rPr>
           </w:pPr>
-          <w:hyperlink w:anchor="_Toc83587074" w:history="1">
+          <w:hyperlink w:anchor="_Toc242093252" w:history="1">
             <w:r>
               <w:rPr>
                 <w:rStyle w:val="Hyperlink"/>
@@ -608,7 +642,9 @@
               <w:rPr>
                 <w:rFonts w:asciiTheme="minorHAnsi" w:eastAsiaTheme="minorEastAsia" w:hAnsiTheme="minorHAnsi"/>
                 <w:noProof/>
-                <w:sz w:val="22"/>
+                <w:kern w:val="2"/>
+                <w:szCs w:val="24"/>
+                <w14:ligatures w14:val="standardContextual"/>
               </w:rPr>
               <w:tab/>
             </w:r>
@@ -617,7 +653,7 @@
                 <w:rStyle w:val="Hyperlink"/>
                 <w:noProof/>
               </w:rPr>
-              <w:t>Downloading Census shapefile</w:t>
+              <w:t>Joining non-spatial census table to a spatial layer</w:t>
             </w:r>
             <w:r>
               <w:rPr>
@@ -638,7 +674,7 @@
                 <w:noProof/>
                 <w:webHidden/>
               </w:rPr>
-              <w:instrText xml:space="preserve"> PAGEREF _Toc83587074 \h </w:instrText>
+              <w:instrText xml:space="preserve"> PAGEREF _Toc242093252 \h </w:instrText>
             </w:r>
             <w:r>
               <w:rPr>
@@ -658,7 +694,7 @@
                 <w:noProof/>
                 <w:webHidden/>
               </w:rPr>
-              <w:t>6</w:t>
+              <w:t>5</w:t>
             </w:r>
             <w:r>
               <w:rPr>
@@ -673,16 +709,18 @@
           <w:pPr>
             <w:pStyle w:val="TOC1"/>
             <w:tabs>
-              <w:tab w:val="left" w:pos="1100"/>
+              <w:tab w:val="left" w:pos="1200"/>
               <w:tab w:val="right" w:leader="dot" w:pos="9350"/>
             </w:tabs>
             <w:rPr>
               <w:rFonts w:asciiTheme="minorHAnsi" w:eastAsiaTheme="minorEastAsia" w:hAnsiTheme="minorHAnsi"/>
               <w:noProof/>
-              <w:sz w:val="22"/>
+              <w:kern w:val="2"/>
+              <w:szCs w:val="24"/>
+              <w14:ligatures w14:val="standardContextual"/>
             </w:rPr>
           </w:pPr>
-          <w:hyperlink w:anchor="_Toc83587075" w:history="1">
+          <w:hyperlink w:anchor="_Toc242093253" w:history="1">
             <w:r>
               <w:rPr>
                 <w:rStyle w:val="Hyperlink"/>
@@ -694,7 +732,9 @@
               <w:rPr>
                 <w:rFonts w:asciiTheme="minorHAnsi" w:eastAsiaTheme="minorEastAsia" w:hAnsiTheme="minorHAnsi"/>
                 <w:noProof/>
-                <w:sz w:val="22"/>
+                <w:kern w:val="2"/>
+                <w:szCs w:val="24"/>
+                <w14:ligatures w14:val="standardContextual"/>
               </w:rPr>
               <w:tab/>
             </w:r>
@@ -703,7 +743,7 @@
                 <w:rStyle w:val="Hyperlink"/>
                 <w:noProof/>
               </w:rPr>
-              <w:t>Loading the census table and shapefile in ArcGIS</w:t>
+              <w:t>Symbolizing the shapefiles by census data</w:t>
             </w:r>
             <w:r>
               <w:rPr>
@@ -724,7 +764,7 @@
                 <w:noProof/>
                 <w:webHidden/>
               </w:rPr>
-              <w:instrText xml:space="preserve"> PAGEREF _Toc83587075 \h </w:instrText>
+              <w:instrText xml:space="preserve"> PAGEREF _Toc242093253 \h </w:instrText>
             </w:r>
             <w:r>
               <w:rPr>
@@ -744,179 +784,7 @@
                 <w:noProof/>
                 <w:webHidden/>
               </w:rPr>
-              <w:t>7</w:t>
-            </w:r>
-            <w:r>
-              <w:rPr>
-                <w:noProof/>
-                <w:webHidden/>
-              </w:rPr>
-              <w:fldChar w:fldCharType="end"/>
-            </w:r>
-          </w:hyperlink>
-        </w:p>
-        <w:p>
-          <w:pPr>
-            <w:pStyle w:val="TOC1"/>
-            <w:tabs>
-              <w:tab w:val="left" w:pos="1100"/>
-              <w:tab w:val="right" w:leader="dot" w:pos="9350"/>
-            </w:tabs>
-            <w:rPr>
-              <w:rFonts w:asciiTheme="minorHAnsi" w:eastAsiaTheme="minorEastAsia" w:hAnsiTheme="minorHAnsi"/>
-              <w:noProof/>
-              <w:sz w:val="22"/>
-            </w:rPr>
-          </w:pPr>
-          <w:hyperlink w:anchor="_Toc83587076" w:history="1">
-            <w:r>
-              <w:rPr>
-                <w:rStyle w:val="Hyperlink"/>
-                <w:noProof/>
-              </w:rPr>
-              <w:t>Step 7:</w:t>
-            </w:r>
-            <w:r>
-              <w:rPr>
-                <w:rFonts w:asciiTheme="minorHAnsi" w:eastAsiaTheme="minorEastAsia" w:hAnsiTheme="minorHAnsi"/>
-                <w:noProof/>
-                <w:sz w:val="22"/>
-              </w:rPr>
-              <w:tab/>
-            </w:r>
-            <w:r>
-              <w:rPr>
-                <w:rStyle w:val="Hyperlink"/>
-                <w:noProof/>
-              </w:rPr>
-              <w:t>Joining non-spatial census table to a spatial layer</w:t>
-            </w:r>
-            <w:r>
-              <w:rPr>
-                <w:noProof/>
-                <w:webHidden/>
-              </w:rPr>
-              <w:tab/>
-            </w:r>
-            <w:r>
-              <w:rPr>
-                <w:noProof/>
-                <w:webHidden/>
-              </w:rPr>
-              <w:fldChar w:fldCharType="begin"/>
-            </w:r>
-            <w:r>
-              <w:rPr>
-                <w:noProof/>
-                <w:webHidden/>
-              </w:rPr>
-              <w:instrText xml:space="preserve"> PAGEREF _Toc83587076 \h </w:instrText>
-            </w:r>
-            <w:r>
-              <w:rPr>
-                <w:noProof/>
-                <w:webHidden/>
-              </w:rPr>
-            </w:r>
-            <w:r>
-              <w:rPr>
-                <w:noProof/>
-                <w:webHidden/>
-              </w:rPr>
-              <w:fldChar w:fldCharType="separate"/>
-            </w:r>
-            <w:r>
-              <w:rPr>
-                <w:noProof/>
-                <w:webHidden/>
-              </w:rPr>
-              <w:t>8</w:t>
-            </w:r>
-            <w:r>
-              <w:rPr>
-                <w:noProof/>
-                <w:webHidden/>
-              </w:rPr>
-              <w:fldChar w:fldCharType="end"/>
-            </w:r>
-          </w:hyperlink>
-        </w:p>
-        <w:p>
-          <w:pPr>
-            <w:pStyle w:val="TOC1"/>
-            <w:tabs>
-              <w:tab w:val="left" w:pos="1100"/>
-              <w:tab w:val="right" w:leader="dot" w:pos="9350"/>
-            </w:tabs>
-            <w:rPr>
-              <w:rFonts w:asciiTheme="minorHAnsi" w:eastAsiaTheme="minorEastAsia" w:hAnsiTheme="minorHAnsi"/>
-              <w:noProof/>
-              <w:sz w:val="22"/>
-            </w:rPr>
-          </w:pPr>
-          <w:hyperlink w:anchor="_Toc83587077" w:history="1">
-            <w:r>
-              <w:rPr>
-                <w:rStyle w:val="Hyperlink"/>
-                <w:noProof/>
-              </w:rPr>
-              <w:t>Step 8:</w:t>
-            </w:r>
-            <w:r>
-              <w:rPr>
-                <w:rFonts w:asciiTheme="minorHAnsi" w:eastAsiaTheme="minorEastAsia" w:hAnsiTheme="minorHAnsi"/>
-                <w:noProof/>
-                <w:sz w:val="22"/>
-              </w:rPr>
-              <w:tab/>
-            </w:r>
-            <w:r>
-              <w:rPr>
-                <w:rStyle w:val="Hyperlink"/>
-                <w:noProof/>
-              </w:rPr>
-              <w:t>Symbolizing the shapefiles by census data</w:t>
-            </w:r>
-            <w:r>
-              <w:rPr>
-                <w:noProof/>
-                <w:webHidden/>
-              </w:rPr>
-              <w:tab/>
-            </w:r>
-            <w:r>
-              <w:rPr>
-                <w:noProof/>
-                <w:webHidden/>
-              </w:rPr>
-              <w:fldChar w:fldCharType="begin"/>
-            </w:r>
-            <w:r>
-              <w:rPr>
-                <w:noProof/>
-                <w:webHidden/>
-              </w:rPr>
-              <w:instrText xml:space="preserve"> PAGEREF _Toc83587077 \h </w:instrText>
-            </w:r>
-            <w:r>
-              <w:rPr>
-                <w:noProof/>
-                <w:webHidden/>
-              </w:rPr>
-            </w:r>
-            <w:r>
-              <w:rPr>
-                <w:noProof/>
-                <w:webHidden/>
-              </w:rPr>
-              <w:fldChar w:fldCharType="separate"/>
-            </w:r>
-            <w:r>
-              <w:rPr>
-                <w:noProof/>
-                <w:webHidden/>
-              </w:rPr>
-              <w:t>8</w:t>
+              <w:t>5</w:t>
             </w:r>
             <w:r>
               <w:rPr>
@@ -941,8 +809,16 @@
     </w:sdt>
     <w:p>
       <w:r>
-        <w:pict w14:anchorId="1373CDC4">
-          <v:rect id="_x0000_i1027" style="width:0;height:.75pt" o:hralign="center" o:hrstd="t" o:hrnoshade="t" o:hr="t" fillcolor="#ccc" stroked="f"/>
+        <w:rPr>
+          <w:noProof/>
+        </w:rPr>
+      </w:r>
+      <w:r>
+        <w:pict w14:anchorId="2967CDB8">
+          <v:rect id="Horizontal Line 3" o:spid="_x0000_s1026" style="width:468pt;height:.35pt;visibility:visible;mso-wrap-style:square;mso-left-percent:-10001;mso-top-percent:-10001;mso-position-horizontal:absolute;mso-position-horizontal-relative:char;mso-position-vertical:absolute;mso-position-vertical-relative:line;mso-left-percent:-10001;mso-top-percent:-10001;v-text-anchor:top" o:gfxdata="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" fillcolor="#ccc" stroked="f">
+            <o:lock v:ext="edit" rotation="t" aspectratio="t" verticies="t" text="t" shapetype="t"/>
+            <w10:anchorlock/>
+          </v:rect>
         </w:pict>
       </w:r>
       <w:bookmarkEnd w:id="0"/>
@@ -954,7 +830,7 @@
           <w:rFonts w:ascii="Helvetica" w:hAnsi="Helvetica" w:cs="Helvetica"/>
         </w:rPr>
       </w:pPr>
-      <w:bookmarkStart w:id="1" w:name="_Toc83587070"/>
+      <w:bookmarkStart w:id="1" w:name="_Toc242093248"/>
       <w:r>
         <w:t>Create a new ArcGIS project and o</w:t>
       </w:r>
@@ -1027,37 +903,75 @@
         <w:pStyle w:val="Instructions-GIS"/>
       </w:pPr>
       <w:r>
+        <w:t xml:space="preserve">You need to download county-level data for the entire United States. Our dataset is the </w:t>
+      </w:r>
+      <w:r>
+        <w:rPr>
+          <w:rStyle w:val="Strong"/>
+        </w:rPr>
+        <w:t>American Community Survey (ACS) 20</w:t>
+      </w:r>
+      <w:r>
+        <w:rPr>
+          <w:rStyle w:val="Strong"/>
+        </w:rPr>
+        <w:t>1</w:t>
+      </w:r>
+      <w:r>
+        <w:rPr>
+          <w:rStyle w:val="Strong"/>
+        </w:rPr>
+        <w:t>8—</w:t>
+      </w:r>
+      <w:r>
+        <w:rPr>
+          <w:rStyle w:val="Strong"/>
+        </w:rPr>
+        <w:t>20</w:t>
+      </w:r>
+      <w:r>
+        <w:rPr>
+          <w:rStyle w:val="Strong"/>
+        </w:rPr>
+        <w:t xml:space="preserve">22 </w:t>
+      </w:r>
+      <w:r>
+        <w:rPr>
+          <w:rStyle w:val="Strong"/>
+        </w:rPr>
+        <w:t>(5-Year Estimates)</w:t>
+      </w:r>
+      <w:r>
+        <w:t>.</w:t>
+      </w:r>
+    </w:p>
+    <w:p>
+      <w:pPr>
+        <w:pStyle w:val="Instructions-GIS"/>
+      </w:pPr>
+      <w:r>
         <w:lastRenderedPageBreak/>
-        <w:t xml:space="preserve">Click on the </w:t>
+        <w:t xml:space="preserve">You’ll use </w:t>
+      </w:r>
+      <w:r>
+        <w:t xml:space="preserve">table </w:t>
       </w:r>
       <w:r>
         <w:rPr>
           <w:b/>
         </w:rPr>
-        <w:t xml:space="preserve">Tables </w:t>
-      </w:r>
-      <w:r>
-        <w:t xml:space="preserve"> tab.</w:t>
-      </w:r>
-    </w:p>
-    <w:p>
-      <w:pPr>
-        <w:pStyle w:val="Instructions-GIS"/>
-      </w:pPr>
-      <w:r>
-        <w:rPr>
-          <w:rFonts w:eastAsiaTheme="minorHAnsi"/>
-        </w:rPr>
-        <w:t xml:space="preserve">Next, </w:t>
-      </w:r>
-      <w:r>
-        <w:rPr>
-          <w:rFonts w:eastAsiaTheme="minorHAnsi"/>
-        </w:rPr>
-        <w:t>e</w:t>
-      </w:r>
-      <w:r>
-        <w:t>xpand</w:t>
+        <w:t>B15002</w:t>
+      </w:r>
+      <w:r>
+        <w:t xml:space="preserve"> (Sex by educational attainment for population 25 years and over)</w:t>
+      </w:r>
+      <w:r>
+        <w:t xml:space="preserve">. Develop the appropriate query and download the csv that you need. </w:t>
+      </w:r>
+    </w:p>
+    <w:p>
+      <w:r>
+        <w:t>You will also want to download the</w:t>
       </w:r>
       <w:r>
         <w:t xml:space="preserve"> </w:t>
@@ -1066,896 +980,24 @@
         <w:rPr>
           <w:b/>
         </w:rPr>
-        <w:t>American Community Surveys (5-Year Estimates)</w:t>
-      </w:r>
-      <w:r>
-        <w:t>.</w:t>
-      </w:r>
-    </w:p>
-    <w:p>
-      <w:pPr>
-        <w:pStyle w:val="Instructions-GIS"/>
-      </w:pPr>
-      <w:r>
-        <w:t>Click</w:t>
-      </w:r>
-      <w:r>
-        <w:t xml:space="preserve"> on </w:t>
-      </w:r>
-      <w:r>
-        <w:rPr>
-          <w:b/>
-        </w:rPr>
-        <w:t>Begin Report</w:t>
-      </w:r>
-      <w:r>
-        <w:t xml:space="preserve"> link next to </w:t>
-      </w:r>
-      <w:r>
-        <w:rPr>
-          <w:rStyle w:val="Strong"/>
-        </w:rPr>
-        <w:t>American Community Survey (ACS) 20</w:t>
-      </w:r>
-      <w:r>
-        <w:rPr>
-          <w:rStyle w:val="Strong"/>
-        </w:rPr>
-        <w:t>1</w:t>
-      </w:r>
-      <w:r>
-        <w:rPr>
-          <w:rStyle w:val="Strong"/>
-        </w:rPr>
-        <w:t>8—</w:t>
-      </w:r>
-      <w:r>
-        <w:rPr>
-          <w:rStyle w:val="Strong"/>
-        </w:rPr>
-        <w:t>20</w:t>
-      </w:r>
-      <w:r>
-        <w:rPr>
-          <w:rStyle w:val="Strong"/>
-        </w:rPr>
-        <w:t xml:space="preserve">22 </w:t>
-      </w:r>
-      <w:r>
-        <w:rPr>
-          <w:rStyle w:val="Strong"/>
-        </w:rPr>
-        <w:t>(5-Year Estimates)</w:t>
-      </w:r>
-      <w:r>
-        <w:t>.</w:t>
-      </w:r>
-    </w:p>
-    <w:p>
-      <w:r>
-        <w:t xml:space="preserve">This </w:t>
-      </w:r>
-      <w:r>
-        <w:t>places</w:t>
-      </w:r>
-      <w:r>
-        <w:t xml:space="preserve"> you</w:t>
-      </w:r>
-      <w:r>
-        <w:t xml:space="preserve"> in</w:t>
-      </w:r>
-      <w:r>
-        <w:t xml:space="preserve"> the </w:t>
-      </w:r>
-      <w:r>
-        <w:rPr>
-          <w:i/>
-        </w:rPr>
-        <w:t>data query</w:t>
-      </w:r>
-      <w:r>
-        <w:t xml:space="preserve"> environment.</w:t>
+        <w:t>data dictionary</w:t>
+      </w:r>
+      <w:r>
+        <w:t xml:space="preserve"> which provides descriptive information on the table’s attribute values.</w:t>
       </w:r>
     </w:p>
     <w:p>
       <w:pPr>
         <w:pStyle w:val="Stepheader-GIS"/>
       </w:pPr>
-      <w:bookmarkStart w:id="2" w:name="_Toc83587071"/>
-      <w:r>
-        <w:t>Selecting the spatial extent</w:t>
+      <w:bookmarkStart w:id="2" w:name="_Toc242093249"/>
+      <w:r>
+        <w:t xml:space="preserve">Modifying the census data table in </w:t>
+      </w:r>
+      <w:r>
+        <w:t>ArcGIS Pro</w:t>
       </w:r>
       <w:bookmarkEnd w:id="2"/>
-    </w:p>
-    <w:p>
-      <w:r>
-        <w:t xml:space="preserve">You will download </w:t>
-      </w:r>
-      <w:r>
-        <w:t xml:space="preserve">educational attainment </w:t>
-      </w:r>
-      <w:r>
-        <w:t xml:space="preserve">data for each </w:t>
-      </w:r>
-      <w:r>
-        <w:rPr>
-          <w:b/>
-        </w:rPr>
-        <w:t>county</w:t>
-      </w:r>
-      <w:r>
-        <w:t xml:space="preserve"> in the </w:t>
-      </w:r>
-      <w:r>
-        <w:rPr>
-          <w:b/>
-        </w:rPr>
-        <w:t>US</w:t>
-      </w:r>
-      <w:r>
-        <w:t xml:space="preserve"> in a tabulated form. In subsequent steps, you will join this table to a shapefile of </w:t>
-      </w:r>
-      <w:r>
-        <w:t xml:space="preserve">the US </w:t>
-      </w:r>
-      <w:r>
-        <w:t>counties.</w:t>
-      </w:r>
-      <w:r>
-        <w:t xml:space="preserve"> Note that you can download data aggregated down to the census block-group level with the ACS </w:t>
-      </w:r>
-      <w:r>
-        <w:t>five-year data sets</w:t>
-      </w:r>
-      <w:r>
-        <w:t>.</w:t>
-      </w:r>
-    </w:p>
-    <w:p>
-      <w:pPr>
-        <w:pStyle w:val="Instructions-GIS"/>
-      </w:pPr>
-      <w:r>
-        <w:t xml:space="preserve">Under </w:t>
-      </w:r>
-      <w:r>
-        <w:rPr>
-          <w:b/>
-          <w:i/>
-        </w:rPr>
-        <w:t>select a geographic type</w:t>
-      </w:r>
-      <w:r>
-        <w:t xml:space="preserve"> select </w:t>
-      </w:r>
-      <w:r>
-        <w:rPr>
-          <w:b/>
-        </w:rPr>
-        <w:t>County</w:t>
-      </w:r>
-      <w:r>
-        <w:t>.</w:t>
-      </w:r>
-    </w:p>
-    <w:p>
-      <w:r>
-        <w:t xml:space="preserve">Do not change the </w:t>
-      </w:r>
-      <w:r>
-        <w:rPr>
-          <w:b/>
-          <w:i/>
-        </w:rPr>
-        <w:t>select a state</w:t>
-      </w:r>
-      <w:r>
-        <w:t xml:space="preserve"> option. However, if you wanted to restrict the analysis to a single state, you would define the state </w:t>
-      </w:r>
-      <w:r>
-        <w:t>in this step</w:t>
-      </w:r>
-      <w:r>
-        <w:t>.</w:t>
-      </w:r>
-    </w:p>
-    <w:p>
-      <w:pPr>
-        <w:pStyle w:val="Instructions-GIS"/>
-      </w:pPr>
-      <w:r>
-        <w:rPr>
-          <w:noProof/>
-        </w:rPr>
-        <w:drawing>
-          <wp:inline distT="0" distB="0" distL="0" distR="0" wp14:anchorId="5552729C" wp14:editId="53C43D38">
-            <wp:extent cx="5943600" cy="2888615"/>
-            <wp:effectExtent l="0" t="0" r="0" b="6985"/>
-            <wp:docPr id="3" name="Picture 3" descr="Graphical user interface, text, application, email&#10;&#10;Description automatically generated"/>
-            <wp:cNvGraphicFramePr>
-              <a:graphicFrameLocks xmlns:a="http://schemas.openxmlformats.org/drawingml/2006/main" noChangeAspect="1"/>
-            </wp:cNvGraphicFramePr>
-            <a:graphic xmlns:a="http://schemas.openxmlformats.org/drawingml/2006/main">
-              <a:graphicData uri="http://schemas.openxmlformats.org/drawingml/2006/picture">
-                <pic:pic xmlns:pic="http://schemas.openxmlformats.org/drawingml/2006/picture">
-                  <pic:nvPicPr>
-                    <pic:cNvPr id="3" name="Picture 3" descr="Graphical user interface, text, application, email&#10;&#10;Description automatically generated"/>
-                    <pic:cNvPicPr/>
-                  </pic:nvPicPr>
-                  <pic:blipFill>
-                    <a:blip r:embed="rId8"/>
-                    <a:stretch>
-                      <a:fillRect/>
-                    </a:stretch>
-                  </pic:blipFill>
-                  <pic:spPr>
-                    <a:xfrm>
-                      <a:off x="0" y="0"/>
-                      <a:ext cx="5943600" cy="2888615"/>
-                    </a:xfrm>
-                    <a:prstGeom prst="rect">
-                      <a:avLst/>
-                    </a:prstGeom>
-                  </pic:spPr>
-                </pic:pic>
-              </a:graphicData>
-            </a:graphic>
-          </wp:inline>
-        </w:drawing>
-      </w:r>
-    </w:p>
-    <w:p>
-      <w:pPr>
-        <w:pStyle w:val="Instructions-GIS"/>
-      </w:pPr>
-      <w:r>
-        <w:t xml:space="preserve">Under </w:t>
-      </w:r>
-      <w:r>
-        <w:rPr>
-          <w:b/>
-          <w:i/>
-        </w:rPr>
-        <w:t>sele</w:t>
-      </w:r>
-      <w:r>
-        <w:rPr>
-          <w:b/>
-          <w:i/>
-        </w:rPr>
-        <w:t>ct one or more geographic areas</w:t>
-      </w:r>
-      <w:r>
-        <w:t xml:space="preserve">, select </w:t>
-      </w:r>
-      <w:r>
-        <w:rPr>
-          <w:b/>
-        </w:rPr>
-        <w:t xml:space="preserve">All Counties </w:t>
-      </w:r>
-      <w:r>
-        <w:t xml:space="preserve">then click </w:t>
-      </w:r>
-      <w:r>
-        <w:t xml:space="preserve">on </w:t>
-      </w:r>
-      <w:r>
-        <w:t xml:space="preserve">the </w:t>
-      </w:r>
-      <w:r>
-        <w:rPr>
-          <w:b/>
-          <w:i/>
-        </w:rPr>
-        <w:t>Add</w:t>
-      </w:r>
-      <w:r>
-        <w:t xml:space="preserve"> link just beneath the selection window</w:t>
-      </w:r>
-      <w:r>
-        <w:t>.</w:t>
-      </w:r>
-    </w:p>
-    <w:p>
-      <w:pPr>
-        <w:pStyle w:val="Instructions-GIS"/>
-      </w:pPr>
-      <w:r>
-        <w:rPr>
-          <w:noProof/>
-        </w:rPr>
-        <w:lastRenderedPageBreak/>
-        <w:drawing>
-          <wp:inline distT="0" distB="0" distL="0" distR="0" wp14:anchorId="50990B9B" wp14:editId="1A5F17CC">
-            <wp:extent cx="6906589" cy="6373114"/>
-            <wp:effectExtent l="0" t="0" r="8890" b="8890"/>
-            <wp:docPr id="452701843" name="Picture 1"/>
-            <wp:cNvGraphicFramePr>
-              <a:graphicFrameLocks xmlns:a="http://schemas.openxmlformats.org/drawingml/2006/main" noChangeAspect="1"/>
-            </wp:cNvGraphicFramePr>
-            <a:graphic xmlns:a="http://schemas.openxmlformats.org/drawingml/2006/main">
-              <a:graphicData uri="http://schemas.openxmlformats.org/drawingml/2006/picture">
-                <pic:pic xmlns:pic="http://schemas.openxmlformats.org/drawingml/2006/picture">
-                  <pic:nvPicPr>
-                    <pic:cNvPr id="452701843" name=""/>
-                    <pic:cNvPicPr/>
-                  </pic:nvPicPr>
-                  <pic:blipFill>
-                    <a:blip r:embed="rId9"/>
-                    <a:stretch>
-                      <a:fillRect/>
-                    </a:stretch>
-                  </pic:blipFill>
-                  <pic:spPr>
-                    <a:xfrm>
-                      <a:off x="0" y="0"/>
-                      <a:ext cx="6906589" cy="6373114"/>
-                    </a:xfrm>
-                    <a:prstGeom prst="rect">
-                      <a:avLst/>
-                    </a:prstGeom>
-                  </pic:spPr>
-                </pic:pic>
-              </a:graphicData>
-            </a:graphic>
-          </wp:inline>
-        </w:drawing>
-      </w:r>
-    </w:p>
-    <w:p>
-      <w:pPr>
-        <w:pStyle w:val="Instructions-GIS"/>
-      </w:pPr>
-    </w:p>
-    <w:p>
-      <w:pPr>
-        <w:pStyle w:val="Instructions-GIS"/>
-      </w:pPr>
-      <w:r>
-        <w:t xml:space="preserve">Click on </w:t>
-      </w:r>
-      <w:r>
-        <w:rPr>
-          <w:b/>
-        </w:rPr>
-        <w:t>Proceed to Tables</w:t>
-      </w:r>
-      <w:r>
-        <w:t xml:space="preserve"> to proceed to the attribute selection step.</w:t>
-      </w:r>
-    </w:p>
-    <w:p>
-      <w:pPr>
-        <w:pStyle w:val="Stepheader-GIS"/>
-      </w:pPr>
-      <w:bookmarkStart w:id="3" w:name="_Toc83587072"/>
-      <w:r>
-        <w:t xml:space="preserve">Selecting </w:t>
-      </w:r>
-      <w:r>
-        <w:t xml:space="preserve">and downloading </w:t>
-      </w:r>
-      <w:r>
-        <w:t>census attributes</w:t>
-      </w:r>
-      <w:bookmarkEnd w:id="3"/>
-    </w:p>
-    <w:p>
-      <w:r>
-        <w:t xml:space="preserve">The Social Explorer website provides you with both </w:t>
-      </w:r>
-      <w:r>
-        <w:t xml:space="preserve">the </w:t>
-      </w:r>
-      <w:r>
-        <w:t>original census data tables and</w:t>
-      </w:r>
-      <w:r>
-        <w:t xml:space="preserve"> </w:t>
-      </w:r>
-      <w:r>
-        <w:t>a ‘filtered’ version of these</w:t>
-      </w:r>
-      <w:r>
-        <w:t xml:space="preserve"> data tables. The census ACS dataset is </w:t>
-      </w:r>
-      <w:r>
-        <w:t>based on</w:t>
-      </w:r>
-      <w:r>
-        <w:t xml:space="preserve"> sample surveys (not total enumeration) and therefore </w:t>
-      </w:r>
-      <w:r>
-        <w:t>provides only</w:t>
-      </w:r>
-      <w:r>
-        <w:t xml:space="preserve"> </w:t>
-      </w:r>
-      <w:r>
-        <w:rPr>
-          <w:i/>
-        </w:rPr>
-        <w:t>estimate</w:t>
-      </w:r>
-      <w:r>
-        <w:rPr>
-          <w:i/>
-        </w:rPr>
-        <w:t>d</w:t>
-      </w:r>
-      <w:r>
-        <w:t xml:space="preserve"> total </w:t>
-      </w:r>
-      <w:r>
-        <w:t>counts</w:t>
-      </w:r>
-      <w:r>
-        <w:t xml:space="preserve">. </w:t>
-      </w:r>
-    </w:p>
-    <w:p>
-      <w:r>
-        <w:lastRenderedPageBreak/>
-        <w:t xml:space="preserve">The </w:t>
-      </w:r>
-      <w:r>
-        <w:t>U.S. C</w:t>
-      </w:r>
-      <w:r>
-        <w:t xml:space="preserve">ensus </w:t>
-      </w:r>
-      <w:r>
-        <w:t>B</w:t>
-      </w:r>
-      <w:r>
-        <w:t xml:space="preserve">ureau provides an estimate of the error along with its dataset. </w:t>
-      </w:r>
-      <w:r>
-        <w:t>T</w:t>
-      </w:r>
-      <w:r>
-        <w:t>he filtered version of the table</w:t>
-      </w:r>
-      <w:r>
-        <w:t xml:space="preserve">s </w:t>
-      </w:r>
-      <w:r>
-        <w:rPr>
-          <w:u w:val="single"/>
-        </w:rPr>
-        <w:t>excludes</w:t>
-      </w:r>
-      <w:r>
-        <w:t xml:space="preserve"> the margin of error (MoE) data. It’s always good practice to work with both the </w:t>
-      </w:r>
-      <w:r>
-        <w:rPr>
-          <w:i/>
-        </w:rPr>
-        <w:t>estimate</w:t>
-      </w:r>
-      <w:r>
-        <w:t xml:space="preserve"> and the </w:t>
-      </w:r>
-      <w:r>
-        <w:rPr>
-          <w:i/>
-        </w:rPr>
-        <w:t>MoE</w:t>
-      </w:r>
-      <w:r>
-        <w:t xml:space="preserve"> data, so in keeping with good practice you</w:t>
-      </w:r>
-      <w:r>
-        <w:t xml:space="preserve"> will </w:t>
-      </w:r>
-      <w:r>
-        <w:t xml:space="preserve">choose to </w:t>
-      </w:r>
-      <w:r>
-        <w:t>select</w:t>
-      </w:r>
-      <w:r>
-        <w:t xml:space="preserve"> the original census data table (note that this tutorial will </w:t>
-      </w:r>
-      <w:r>
-        <w:rPr>
-          <w:i/>
-        </w:rPr>
-        <w:t>not</w:t>
-      </w:r>
-      <w:r>
-        <w:t xml:space="preserve"> make use of the MoE</w:t>
-      </w:r>
-      <w:r>
-        <w:t>).</w:t>
-      </w:r>
-    </w:p>
-    <w:p>
-      <w:pPr>
-        <w:pStyle w:val="Instructions-GIS"/>
-      </w:pPr>
-      <w:r>
-        <w:t xml:space="preserve">Search for table </w:t>
-      </w:r>
-      <w:r>
-        <w:rPr>
-          <w:b/>
-        </w:rPr>
-        <w:t>B15002</w:t>
-      </w:r>
-      <w:r>
-        <w:t xml:space="preserve"> (Sex by educational attainment for population 25 years and over) then add it to the </w:t>
-      </w:r>
-      <w:r>
-        <w:rPr>
-          <w:b/>
-        </w:rPr>
-        <w:t>Table Selections</w:t>
-      </w:r>
-      <w:r>
-        <w:t xml:space="preserve"> window.</w:t>
-      </w:r>
-    </w:p>
-    <w:p>
-      <w:pPr>
-        <w:pStyle w:val="Instructions-GIS"/>
-      </w:pPr>
-      <w:r>
-        <w:t xml:space="preserve">Click on </w:t>
-      </w:r>
-      <w:r>
-        <w:rPr>
-          <w:b/>
-        </w:rPr>
-        <w:t>Show Result</w:t>
-      </w:r>
-      <w:r>
-        <w:rPr>
-          <w:b/>
-        </w:rPr>
-        <w:t>s</w:t>
-      </w:r>
-      <w:r>
-        <w:t xml:space="preserve"> to proceed to the next page.</w:t>
-      </w:r>
-    </w:p>
-    <w:p>
-      <w:pPr>
-        <w:pStyle w:val="Instructions-GIS"/>
-      </w:pPr>
-      <w:r>
-        <w:t xml:space="preserve">On the next page, select the </w:t>
-      </w:r>
-      <w:r>
-        <w:rPr>
-          <w:b/>
-        </w:rPr>
-        <w:t>Data Download</w:t>
-      </w:r>
-      <w:r>
-        <w:t xml:space="preserve"> tab.</w:t>
-      </w:r>
-    </w:p>
-    <w:p>
-      <w:pPr>
-        <w:pStyle w:val="Instructions-GIS"/>
-      </w:pPr>
-      <w:r>
-        <w:drawing>
-          <wp:inline distT="0" distB="0" distL="0" distR="0" wp14:anchorId="27D442E0" wp14:editId="465BD37E">
-            <wp:extent cx="5943600" cy="1822450"/>
-            <wp:effectExtent l="0" t="0" r="0" b="6350"/>
-            <wp:docPr id="215397228" name="Picture 1" descr="A screenshot of a computer&#10;&#10;Description automatically generated"/>
-            <wp:cNvGraphicFramePr>
-              <a:graphicFrameLocks xmlns:a="http://schemas.openxmlformats.org/drawingml/2006/main" noChangeAspect="1"/>
-            </wp:cNvGraphicFramePr>
-            <a:graphic xmlns:a="http://schemas.openxmlformats.org/drawingml/2006/main">
-              <a:graphicData uri="http://schemas.openxmlformats.org/drawingml/2006/picture">
-                <pic:pic xmlns:pic="http://schemas.openxmlformats.org/drawingml/2006/picture">
-                  <pic:nvPicPr>
-                    <pic:cNvPr id="215397228" name="Picture 1" descr="A screenshot of a computer&#10;&#10;Description automatically generated"/>
-                    <pic:cNvPicPr/>
-                  </pic:nvPicPr>
-                  <pic:blipFill>
-                    <a:blip r:embed="rId10"/>
-                    <a:stretch>
-                      <a:fillRect/>
-                    </a:stretch>
-                  </pic:blipFill>
-                  <pic:spPr>
-                    <a:xfrm>
-                      <a:off x="0" y="0"/>
-                      <a:ext cx="5943600" cy="1822450"/>
-                    </a:xfrm>
-                    <a:prstGeom prst="rect">
-                      <a:avLst/>
-                    </a:prstGeom>
-                  </pic:spPr>
-                </pic:pic>
-              </a:graphicData>
-            </a:graphic>
-          </wp:inline>
-        </w:drawing>
-      </w:r>
-    </w:p>
-    <w:p>
-      <w:pPr>
-        <w:pStyle w:val="Instructions-GIS"/>
-      </w:pPr>
-      <w:r>
-        <w:t xml:space="preserve">Click on the </w:t>
-      </w:r>
-      <w:r>
-        <w:rPr>
-          <w:b/>
-        </w:rPr>
-        <w:t>County data (CSV)</w:t>
-      </w:r>
-      <w:r>
-        <w:t xml:space="preserve"> link to download the data.</w:t>
-      </w:r>
-    </w:p>
-    <w:p>
-      <w:pPr>
-        <w:pStyle w:val="Instructions-GIS"/>
-      </w:pPr>
-      <w:r>
-        <w:rPr>
-          <w:noProof/>
-        </w:rPr>
-        <w:drawing>
-          <wp:inline distT="0" distB="0" distL="0" distR="0" wp14:anchorId="21F04541" wp14:editId="199D97D2">
-            <wp:extent cx="2886075" cy="952500"/>
-            <wp:effectExtent l="0" t="0" r="9525" b="0"/>
-            <wp:docPr id="14" name="Picture 14"/>
-            <wp:cNvGraphicFramePr>
-              <a:graphicFrameLocks xmlns:a="http://schemas.openxmlformats.org/drawingml/2006/main" noChangeAspect="1"/>
-            </wp:cNvGraphicFramePr>
-            <a:graphic xmlns:a="http://schemas.openxmlformats.org/drawingml/2006/main">
-              <a:graphicData uri="http://schemas.openxmlformats.org/drawingml/2006/picture">
-                <pic:pic xmlns:pic="http://schemas.openxmlformats.org/drawingml/2006/picture">
-                  <pic:nvPicPr>
-                    <pic:cNvPr id="1" name=""/>
-                    <pic:cNvPicPr/>
-                  </pic:nvPicPr>
-                  <pic:blipFill>
-                    <a:blip r:embed="rId11"/>
-                    <a:stretch>
-                      <a:fillRect/>
-                    </a:stretch>
-                  </pic:blipFill>
-                  <pic:spPr>
-                    <a:xfrm>
-                      <a:off x="0" y="0"/>
-                      <a:ext cx="2886075" cy="952500"/>
-                    </a:xfrm>
-                    <a:prstGeom prst="rect">
-                      <a:avLst/>
-                    </a:prstGeom>
-                  </pic:spPr>
-                </pic:pic>
-              </a:graphicData>
-            </a:graphic>
-          </wp:inline>
-        </w:drawing>
-      </w:r>
-    </w:p>
-    <w:p>
-      <w:pPr>
-        <w:pStyle w:val="Instructions-GIS"/>
-      </w:pPr>
-      <w:r>
-        <w:t>Note the file</w:t>
-      </w:r>
-      <w:r>
-        <w:t xml:space="preserve"> </w:t>
-      </w:r>
-      <w:r>
-        <w:rPr>
-          <w:i/>
-        </w:rPr>
-        <w:t>name</w:t>
-      </w:r>
-      <w:r>
-        <w:t xml:space="preserve"> you are downloading! You will need this information when </w:t>
-      </w:r>
-      <w:r>
-        <w:t>locating</w:t>
-      </w:r>
-      <w:r>
-        <w:t xml:space="preserve"> the file in the Downloads Folder</w:t>
-      </w:r>
-      <w:r>
-        <w:t xml:space="preserve"> on your </w:t>
-      </w:r>
-      <w:r>
-        <w:t>computer</w:t>
-      </w:r>
-      <w:r>
-        <w:t>.</w:t>
-      </w:r>
-    </w:p>
-    <w:p>
-      <w:r>
-        <w:t>You will also want to download the</w:t>
-      </w:r>
-      <w:r>
-        <w:t xml:space="preserve"> </w:t>
-      </w:r>
-      <w:r>
-        <w:rPr>
-          <w:b/>
-        </w:rPr>
-        <w:t>data dictionary</w:t>
-      </w:r>
-      <w:r>
-        <w:t xml:space="preserve"> which provides descriptive information on the table’s attribute values.</w:t>
-      </w:r>
-    </w:p>
-    <w:p>
-      <w:pPr>
-        <w:pStyle w:val="Instructions-GIS"/>
-      </w:pPr>
-      <w:r>
-        <w:t xml:space="preserve">Click on the </w:t>
-      </w:r>
-      <w:r>
-        <w:rPr>
-          <w:b/>
-        </w:rPr>
-        <w:t>Data dictionary</w:t>
-      </w:r>
-      <w:r>
-        <w:t xml:space="preserve"> link near the bottom of the page</w:t>
-      </w:r>
-      <w:r>
-        <w:t>.</w:t>
-      </w:r>
-    </w:p>
-    <w:p>
-      <w:r>
-        <w:rPr>
-          <w:noProof/>
-        </w:rPr>
-        <w:drawing>
-          <wp:inline distT="0" distB="0" distL="0" distR="0" wp14:anchorId="4DD61886" wp14:editId="2977A03A">
-            <wp:extent cx="5010849" cy="1066949"/>
-            <wp:effectExtent l="0" t="0" r="0" b="0"/>
-            <wp:docPr id="12" name="Picture 12"/>
-            <wp:cNvGraphicFramePr>
-              <a:graphicFrameLocks xmlns:a="http://schemas.openxmlformats.org/drawingml/2006/main" noChangeAspect="1"/>
-            </wp:cNvGraphicFramePr>
-            <a:graphic xmlns:a="http://schemas.openxmlformats.org/drawingml/2006/main">
-              <a:graphicData uri="http://schemas.openxmlformats.org/drawingml/2006/picture">
-                <pic:pic xmlns:pic="http://schemas.openxmlformats.org/drawingml/2006/picture">
-                  <pic:nvPicPr>
-                    <pic:cNvPr id="12" name="6B4AE09.tmp"/>
-                    <pic:cNvPicPr/>
-                  </pic:nvPicPr>
-                  <pic:blipFill>
-                    <a:blip r:embed="rId12">
-                      <a:extLst>
-                        <a:ext uri="{28A0092B-C50C-407E-A947-70E740481C1C}">
-                          <a14:useLocalDpi xmlns:a14="http://schemas.microsoft.com/office/drawing/2010/main" val="0"/>
-                        </a:ext>
-                      </a:extLst>
-                    </a:blip>
-                    <a:stretch>
-                      <a:fillRect/>
-                    </a:stretch>
-                  </pic:blipFill>
-                  <pic:spPr>
-                    <a:xfrm>
-                      <a:off x="0" y="0"/>
-                      <a:ext cx="5010849" cy="1066949"/>
-                    </a:xfrm>
-                    <a:prstGeom prst="rect">
-                      <a:avLst/>
-                    </a:prstGeom>
-                  </pic:spPr>
-                </pic:pic>
-              </a:graphicData>
-            </a:graphic>
-          </wp:inline>
-        </w:drawing>
-      </w:r>
-    </w:p>
-    <w:p>
-      <w:pPr>
-        <w:pStyle w:val="Instructions-GIS"/>
-      </w:pPr>
-      <w:r>
-        <w:lastRenderedPageBreak/>
-        <w:t xml:space="preserve">If prompted, select the </w:t>
-      </w:r>
-      <w:r>
-        <w:rPr>
-          <w:b/>
-        </w:rPr>
-        <w:t>Open with Notepad</w:t>
-      </w:r>
-      <w:r>
-        <w:t xml:space="preserve"> option.</w:t>
-      </w:r>
-    </w:p>
-    <w:p>
-      <w:r>
-        <w:rPr>
-          <w:noProof/>
-        </w:rPr>
-        <w:drawing>
-          <wp:inline distT="0" distB="0" distL="0" distR="0" wp14:anchorId="6D4A98D9" wp14:editId="61D6BD7B">
-            <wp:extent cx="2876550" cy="1733550"/>
-            <wp:effectExtent l="0" t="0" r="0" b="0"/>
-            <wp:docPr id="45" name="Picture 45"/>
-            <wp:cNvGraphicFramePr>
-              <a:graphicFrameLocks xmlns:a="http://schemas.openxmlformats.org/drawingml/2006/main" noChangeAspect="1"/>
-            </wp:cNvGraphicFramePr>
-            <a:graphic xmlns:a="http://schemas.openxmlformats.org/drawingml/2006/main">
-              <a:graphicData uri="http://schemas.openxmlformats.org/drawingml/2006/picture">
-                <pic:pic xmlns:pic="http://schemas.openxmlformats.org/drawingml/2006/picture">
-                  <pic:nvPicPr>
-                    <pic:cNvPr id="0" name=""/>
-                    <pic:cNvPicPr/>
-                  </pic:nvPicPr>
-                  <pic:blipFill>
-                    <a:blip r:embed="rId13"/>
-                    <a:stretch>
-                      <a:fillRect/>
-                    </a:stretch>
-                  </pic:blipFill>
-                  <pic:spPr>
-                    <a:xfrm>
-                      <a:off x="0" y="0"/>
-                      <a:ext cx="2876550" cy="1733550"/>
-                    </a:xfrm>
-                    <a:prstGeom prst="rect">
-                      <a:avLst/>
-                    </a:prstGeom>
-                  </pic:spPr>
-                </pic:pic>
-              </a:graphicData>
-            </a:graphic>
-          </wp:inline>
-        </w:drawing>
-      </w:r>
-    </w:p>
-    <w:p>
-      <w:r>
-        <w:t xml:space="preserve">The column </w:t>
-      </w:r>
-      <w:r>
-        <w:t xml:space="preserve">(attribute) </w:t>
-      </w:r>
-      <w:r>
-        <w:t>information for your dataset is defined in this file.</w:t>
-      </w:r>
-      <w:r>
-        <w:t xml:space="preserve"> </w:t>
-      </w:r>
-    </w:p>
-    <w:p>
-      <w:pPr>
-        <w:pStyle w:val="Instructions-GIS"/>
-      </w:pPr>
-      <w:r>
-        <w:t>Make sure to save the data dictionary file in your project folder for future reference.</w:t>
-      </w:r>
-    </w:p>
-    <w:p>
-      <w:pPr>
-        <w:pStyle w:val="Stepheader-GIS"/>
-      </w:pPr>
-      <w:bookmarkStart w:id="4" w:name="_Toc83587073"/>
-      <w:r>
-        <w:t xml:space="preserve">Modifying the census data table in </w:t>
-      </w:r>
-      <w:bookmarkEnd w:id="4"/>
-      <w:r>
-        <w:t>ArcGIS Pro</w:t>
-      </w:r>
     </w:p>
     <w:p>
       <w:r>
@@ -2157,79 +1199,79 @@
     </w:p>
     <w:p>
       <w:r>
+        <w:t xml:space="preserve">Column </w:t>
+      </w:r>
+      <w:r>
+        <w:rPr>
+          <w:b/>
+        </w:rPr>
+        <w:t>ACS22_5yr_B15002001</w:t>
+      </w:r>
+      <w:r>
+        <w:t xml:space="preserve"> (or simply B15002001 in the data dictionary file) represents total population 25 years or older for each county. This value will be used to normalize </w:t>
+      </w:r>
+      <w:r>
+        <w:t xml:space="preserve">the </w:t>
+      </w:r>
+      <w:r>
+        <w:t xml:space="preserve">population </w:t>
+      </w:r>
+      <w:r>
+        <w:t>having attained</w:t>
+      </w:r>
+      <w:r>
+        <w:t xml:space="preserve"> a bachelor’s degree or greater.</w:t>
+      </w:r>
+    </w:p>
+    <w:p>
+      <w:r>
+        <w:t>Using ArcGIS Pro’s field calculator</w:t>
+      </w:r>
+      <w:r>
+        <w:t xml:space="preserve">, for each county, you will sum all members of the population having a bachelor’s degree or greater for both the male and female population, then divide this sum by the total population </w:t>
+      </w:r>
+      <w:r>
+        <w:t>to generate</w:t>
+      </w:r>
+      <w:r>
+        <w:t xml:space="preserve"> the </w:t>
+      </w:r>
+      <w:r>
+        <w:t>share</w:t>
+      </w:r>
+      <w:r>
+        <w:t xml:space="preserve"> of the</w:t>
+      </w:r>
+      <w:r>
+        <w:t xml:space="preserve"> population </w:t>
+      </w:r>
+      <w:r>
+        <w:t>that has</w:t>
+      </w:r>
+      <w:r>
+        <w:t xml:space="preserve"> attained </w:t>
+      </w:r>
+      <w:r>
+        <w:t>at least a bachelor’s degree</w:t>
+      </w:r>
+      <w:r>
+        <w:t>.</w:t>
+      </w:r>
+      <w:r>
+        <w:t xml:space="preserve"> </w:t>
+      </w:r>
+    </w:p>
+    <w:p>
+      <w:r>
+        <w:t>You cannot directly edit a table in .csv format from within ArcGIS Pro. You’ll need to convert the .csv into a file geodatabase table first, before you can add a field.</w:t>
+      </w:r>
+    </w:p>
+    <w:p>
+      <w:pPr>
+        <w:pStyle w:val="Instructions-GIS"/>
+      </w:pPr>
+      <w:r>
         <w:lastRenderedPageBreak/>
-        <w:t xml:space="preserve">Column </w:t>
-      </w:r>
-      <w:r>
-        <w:rPr>
-          <w:b/>
-        </w:rPr>
-        <w:t>ACS22_5yr_B15002001</w:t>
-      </w:r>
-      <w:r>
-        <w:t xml:space="preserve"> (or simply B15002001 in the data dictionary file) represents total population 25 years or older for each county. This value will be used to normalize </w:t>
-      </w:r>
-      <w:r>
-        <w:t xml:space="preserve">the </w:t>
-      </w:r>
-      <w:r>
-        <w:t xml:space="preserve">population </w:t>
-      </w:r>
-      <w:r>
-        <w:t>having attained</w:t>
-      </w:r>
-      <w:r>
-        <w:t xml:space="preserve"> a bachelor’s degree or greater.</w:t>
-      </w:r>
-    </w:p>
-    <w:p>
-      <w:r>
-        <w:t>Using ArcGIS Pro’s field calculator</w:t>
-      </w:r>
-      <w:r>
-        <w:t xml:space="preserve">, for each county, you will sum all members of the population having a bachelor’s degree or greater for both the male and female population, then divide this sum by the total population </w:t>
-      </w:r>
-      <w:r>
-        <w:t>to generate</w:t>
-      </w:r>
-      <w:r>
-        <w:t xml:space="preserve"> the </w:t>
-      </w:r>
-      <w:r>
-        <w:t>share</w:t>
-      </w:r>
-      <w:r>
-        <w:t xml:space="preserve"> of the</w:t>
-      </w:r>
-      <w:r>
-        <w:t xml:space="preserve"> population </w:t>
-      </w:r>
-      <w:r>
-        <w:t>that has</w:t>
-      </w:r>
-      <w:r>
-        <w:t xml:space="preserve"> attained </w:t>
-      </w:r>
-      <w:r>
-        <w:t>at least a bachelor’s degree</w:t>
-      </w:r>
-      <w:r>
-        <w:t>.</w:t>
-      </w:r>
-      <w:r>
-        <w:t xml:space="preserve"> </w:t>
-      </w:r>
-    </w:p>
-    <w:p>
-      <w:r>
-        <w:t>You cannot directly edit a table in .csv format from within ArcGIS Pro. You’ll need to convert the .csv into a file geodatabase table first, before you can add a field.</w:t>
-      </w:r>
-    </w:p>
-    <w:p>
-      <w:pPr>
-        <w:pStyle w:val="Instructions-GIS"/>
-      </w:pPr>
-      <w:r>
         <w:t xml:space="preserve">Right click on the table </w:t>
       </w:r>
       <w:r>
@@ -2273,7 +1315,7 @@
                     <pic:cNvPicPr/>
                   </pic:nvPicPr>
                   <pic:blipFill>
-                    <a:blip r:embed="rId14"/>
+                    <a:blip r:embed="rId8"/>
                     <a:stretch>
                       <a:fillRect/>
                     </a:stretch>
@@ -2398,7 +1440,7 @@
                     <pic:cNvPicPr/>
                   </pic:nvPicPr>
                   <pic:blipFill>
-                    <a:blip r:embed="rId15"/>
+                    <a:blip r:embed="rId9"/>
                     <a:stretch>
                       <a:fillRect/>
                     </a:stretch>
@@ -2451,11 +1493,11 @@
       <w:pPr>
         <w:pStyle w:val="Stepheader-GIS"/>
       </w:pPr>
-      <w:bookmarkStart w:id="5" w:name="_Toc83587074"/>
+      <w:bookmarkStart w:id="3" w:name="_Toc242093250"/>
       <w:r>
         <w:t>Downloading Census shapefile</w:t>
       </w:r>
-      <w:bookmarkEnd w:id="5"/>
+      <w:bookmarkEnd w:id="3"/>
     </w:p>
     <w:p>
       <w:pPr>
@@ -2464,7 +1506,7 @@
       <w:r>
         <w:t xml:space="preserve">In a web browser, navigate to the Census Bureau’s Tiger shapefiles website: </w:t>
       </w:r>
-      <w:hyperlink r:id="rId16" w:history="1">
+      <w:hyperlink r:id="rId10" w:history="1">
         <w:r>
           <w:rPr>
             <w:rStyle w:val="Hyperlink"/>
@@ -2642,7 +1684,7 @@
       <w:pPr>
         <w:pStyle w:val="Stepheader-GIS"/>
       </w:pPr>
-      <w:bookmarkStart w:id="6" w:name="_Toc83587075"/>
+      <w:bookmarkStart w:id="4" w:name="_Toc242093251"/>
       <w:r>
         <w:t xml:space="preserve">Loading the census table and </w:t>
       </w:r>
@@ -2655,7 +1697,7 @@
       <w:r>
         <w:t>GIS</w:t>
       </w:r>
-      <w:bookmarkEnd w:id="6"/>
+      <w:bookmarkEnd w:id="4"/>
     </w:p>
     <w:p>
       <w:pPr>
@@ -2716,7 +1758,7 @@
                     <pic:cNvPicPr/>
                   </pic:nvPicPr>
                   <pic:blipFill>
-                    <a:blip r:embed="rId17"/>
+                    <a:blip r:embed="rId11"/>
                     <a:stretch>
                       <a:fillRect/>
                     </a:stretch>
@@ -2785,7 +1827,7 @@
       <w:pPr>
         <w:pStyle w:val="Stepheader-GIS"/>
       </w:pPr>
-      <w:bookmarkStart w:id="7" w:name="_Toc83587076"/>
+      <w:bookmarkStart w:id="5" w:name="_Toc242093252"/>
       <w:r>
         <w:t>Joining non-</w:t>
       </w:r>
@@ -2795,7 +1837,7 @@
       <w:r>
         <w:t>census table to a spatial layer</w:t>
       </w:r>
-      <w:bookmarkEnd w:id="7"/>
+      <w:bookmarkEnd w:id="5"/>
     </w:p>
     <w:p>
       <w:r>
@@ -2881,11 +1923,11 @@
       <w:pPr>
         <w:pStyle w:val="Stepheader-GIS"/>
       </w:pPr>
-      <w:bookmarkStart w:id="8" w:name="_Toc83587077"/>
+      <w:bookmarkStart w:id="6" w:name="_Toc242093253"/>
       <w:r>
         <w:t>Symbolizing the shapefiles by census data</w:t>
       </w:r>
-      <w:bookmarkEnd w:id="8"/>
+      <w:bookmarkEnd w:id="6"/>
     </w:p>
     <w:p>
       <w:r>
@@ -3007,7 +2049,7 @@
                     <pic:cNvPicPr/>
                   </pic:nvPicPr>
                   <pic:blipFill>
-                    <a:blip r:embed="rId18"/>
+                    <a:blip r:embed="rId12"/>
                     <a:stretch>
                       <a:fillRect/>
                     </a:stretch>
@@ -3063,7 +2105,7 @@
                     <pic:cNvPicPr/>
                   </pic:nvPicPr>
                   <pic:blipFill>
-                    <a:blip r:embed="rId19"/>
+                    <a:blip r:embed="rId13"/>
                     <a:stretch>
                       <a:fillRect/>
                     </a:stretch>
@@ -3151,7 +2193,7 @@
                     <pic:cNvPicPr/>
                   </pic:nvPicPr>
                   <pic:blipFill>
-                    <a:blip r:embed="rId20" cstate="print">
+                    <a:blip r:embed="rId14" cstate="print">
                       <a:extLst>
                         <a:ext uri="{28A0092B-C50C-407E-A947-70E740481C1C}">
                           <a14:useLocalDpi xmlns:a14="http://schemas.microsoft.com/office/drawing/2010/main" val="0"/>
@@ -3310,7 +2352,7 @@
 </file>
 
 <file path=word/numbering.xml><?xml version="1.0" encoding="utf-8"?>
-<w:numbering xmlns:wpc="http://schemas.microsoft.com/office/word/2010/wordprocessingCanvas" xmlns:cx="http://schemas.microsoft.com/office/drawing/2014/chartex" xmlns:cx1="http://schemas.microsoft.com/office/drawing/2015/9/8/chartex" xmlns:cx2="http://schemas.microsoft.com/office/drawing/2015/10/21/chartex" xmlns:cx3="http://schemas.microsoft.com/office/drawing/2016/5/9/chartex" xmlns:cx4="http://schemas.microsoft.com/office/drawing/2016/5/10/chartex" xmlns:cx5="http://schemas.microsoft.com/office/drawing/2016/5/11/chartex" xmlns:cx6="http://schemas.microsoft.com/office/drawing/2016/5/12/chartex" xmlns:cx7="http://schemas.microsoft.com/office/drawing/2016/5/13/chartex" xmlns:cx8="http://schemas.microsoft.com/office/drawing/2016/5/14/chartex" xmlns:mc="http://schemas.openxmlformats.org/markup-compatibility/2006" xmlns:aink="http://schemas.microsoft.com/office/drawing/2016/ink" xmlns:am3d="http://schemas.microsoft.com/office/drawing/2017/model3d" xmlns:o="urn:schemas-microsoft-com:office:office" xmlns:oel="http://schemas.microsoft.com/office/2019/extlst" xmlns:r="http://schemas.openxmlformats.org/officeDocument/2006/relationships" xmlns:m="http://schemas.openxmlformats.org/officeDocument/2006/math" xmlns:v="urn:schemas-microsoft-com:vml" xmlns:wp14="http://schemas.microsoft.com/office/word/2010/wordprocessingDrawing" xmlns:wp="http://schemas.openxmlformats.org/drawingml/2006/wordprocessingDrawing" xmlns:w10="urn:schemas-microsoft-com:office:word" xmlns:w="http://schemas.openxmlformats.org/wordprocessingml/2006/main" xmlns:w14="http://schemas.microsoft.com/office/word/2010/wordml" xmlns:w15="http://schemas.microsoft.com/office/word/2012/wordml" xmlns:w16cex="http://schemas.microsoft.com/office/word/2018/wordml/cex" xmlns:w16cid="http://schemas.microsoft.com/office/word/2016/wordml/cid" xmlns:w16="http://schemas.microsoft.com/office/word/2018/wordml" xmlns:w16du="http://schemas.microsoft.com/office/word/2023/wordml/word16du" xmlns:w16sdtdh="http://schemas.microsoft.com/office/word/2020/wordml/sdtdatahash" xmlns:w16se="http://schemas.microsoft.com/office/word/2015/wordml/symex" xmlns:wpg="http://schemas.microsoft.com/office/word/2010/wordprocessingGroup" xmlns:wpi="http://schemas.microsoft.com/office/word/2010/wordprocessingInk" xmlns:wne="http://schemas.microsoft.com/office/word/2006/wordml" xmlns:wps="http://schemas.microsoft.com/office/word/2010/wordprocessingShape" mc:Ignorable="w14 w15 w16se w16cid w16 w16cex w16sdtdh w16du wp14">
+<w:numbering xmlns:wpc="http://schemas.microsoft.com/office/word/2010/wordprocessingCanvas" xmlns:cx="http://schemas.microsoft.com/office/drawing/2014/chartex" xmlns:cx1="http://schemas.microsoft.com/office/drawing/2015/9/8/chartex" xmlns:cx2="http://schemas.microsoft.com/office/drawing/2015/10/21/chartex" xmlns:cx3="http://schemas.microsoft.com/office/drawing/2016/5/9/chartex" xmlns:cx4="http://schemas.microsoft.com/office/drawing/2016/5/10/chartex" xmlns:cx5="http://schemas.microsoft.com/office/drawing/2016/5/11/chartex" xmlns:cx6="http://schemas.microsoft.com/office/drawing/2016/5/12/chartex" xmlns:cx7="http://schemas.microsoft.com/office/drawing/2016/5/13/chartex" xmlns:cx8="http://schemas.microsoft.com/office/drawing/2016/5/14/chartex" xmlns:mc="http://schemas.openxmlformats.org/markup-compatibility/2006" xmlns:m="http://schemas.openxmlformats.org/officeDocument/2006/math" xmlns:aink="http://schemas.microsoft.com/office/drawing/2016/ink" xmlns:am3d="http://schemas.microsoft.com/office/drawing/2017/model3d" xmlns:oel="http://schemas.microsoft.com/office/2019/extlst" xmlns:r="http://schemas.openxmlformats.org/officeDocument/2006/relationships" xmlns:wp14="http://schemas.microsoft.com/office/word/2010/wordprocessingDrawing" xmlns:wp="http://schemas.openxmlformats.org/drawingml/2006/wordprocessingDrawing" xmlns:wpg="http://schemas.microsoft.com/office/word/2010/wordprocessingGroup" xmlns:wpi="http://schemas.microsoft.com/office/word/2010/wordprocessingInk" xmlns:wps="http://schemas.microsoft.com/office/word/2010/wordprocessingShape" xmlns:o="urn:schemas-microsoft-com:office:office" xmlns:v="urn:schemas-microsoft-com:vml" xmlns:w10="urn:schemas-microsoft-com:office:word" xmlns:w="http://schemas.openxmlformats.org/wordprocessingml/2006/main" xmlns:w14="http://schemas.microsoft.com/office/word/2010/wordml" xmlns:w15="http://schemas.microsoft.com/office/word/2012/wordml" xmlns:w16cex="http://schemas.microsoft.com/office/word/2018/wordml/cex" xmlns:w16cid="http://schemas.microsoft.com/office/word/2016/wordml/cid" xmlns:w16="http://schemas.microsoft.com/office/word/2018/wordml" xmlns:w16sdtdh="http://schemas.microsoft.com/office/word/2020/wordml/sdtdatahash" xmlns:w16sdtfl="http://schemas.microsoft.com/office/word/2024/wordml/sdtformatlock" xmlns:w16se="http://schemas.microsoft.com/office/word/2015/wordml/symex" xmlns:w16du="http://schemas.microsoft.com/office/word/2023/wordml/word16du" xmlns:wne="http://schemas.microsoft.com/office/word/2006/wordml" mc:Ignorable="w14 w15 w16se w16cid w16 w16cex w16sdtdh w16sdtfl w16du wp14">
   <w:abstractNum w:abstractNumId="0" w15:restartNumberingAfterBreak="0">
     <w:nsid w:val="0C717DE4"/>
     <w:multiLevelType w:val="hybridMultilevel"/>
@@ -4282,7 +3324,7 @@
 </file>
 
 <file path=word/styles.xml><?xml version="1.0" encoding="utf-8"?>
-<w:styles xmlns:mc="http://schemas.openxmlformats.org/markup-compatibility/2006" xmlns:r="http://schemas.openxmlformats.org/officeDocument/2006/relationships" xmlns:w="http://schemas.openxmlformats.org/wordprocessingml/2006/main" xmlns:w14="http://schemas.microsoft.com/office/word/2010/wordml" xmlns:w15="http://schemas.microsoft.com/office/word/2012/wordml" xmlns:w16cex="http://schemas.microsoft.com/office/word/2018/wordml/cex" xmlns:w16cid="http://schemas.microsoft.com/office/word/2016/wordml/cid" xmlns:w16="http://schemas.microsoft.com/office/word/2018/wordml" xmlns:w16du="http://schemas.microsoft.com/office/word/2023/wordml/word16du" xmlns:w16sdtdh="http://schemas.microsoft.com/office/word/2020/wordml/sdtdatahash" xmlns:w16se="http://schemas.microsoft.com/office/word/2015/wordml/symex" mc:Ignorable="w14 w15 w16se w16cid w16 w16cex w16sdtdh w16du">
+<w:styles xmlns:mc="http://schemas.openxmlformats.org/markup-compatibility/2006" xmlns:r="http://schemas.openxmlformats.org/officeDocument/2006/relationships" xmlns:w="http://schemas.openxmlformats.org/wordprocessingml/2006/main" xmlns:w14="http://schemas.microsoft.com/office/word/2010/wordml" xmlns:w15="http://schemas.microsoft.com/office/word/2012/wordml" xmlns:w16cex="http://schemas.microsoft.com/office/word/2018/wordml/cex" xmlns:w16cid="http://schemas.microsoft.com/office/word/2016/wordml/cid" xmlns:w16="http://schemas.microsoft.com/office/word/2018/wordml" xmlns:w16sdtdh="http://schemas.microsoft.com/office/word/2020/wordml/sdtdatahash" xmlns:w16sdtfl="http://schemas.microsoft.com/office/word/2024/wordml/sdtformatlock" xmlns:w16se="http://schemas.microsoft.com/office/word/2015/wordml/symex" xmlns:w16du="http://schemas.microsoft.com/office/word/2023/wordml/word16du" mc:Ignorable="w14 w15 w16se w16cid w16 w16cex w16sdtdh w16sdtfl w16du">
   <w:docDefaults>
     <w:rPrDefault>
       <w:rPr>

</xml_diff>